<commit_message>
added as of 16th-Feb
</commit_message>
<xml_diff>
--- a/AWS/AWS- Cost Optimization.docx
+++ b/AWS/AWS- Cost Optimization.docx
@@ -1306,6 +1306,7 @@
         <w:rPr>
           <w:b/>
           <w:bCs/>
+          <w:noProof/>
           <w:sz w:val="28"/>
           <w:szCs w:val="28"/>
         </w:rPr>
@@ -1355,25 +1356,14 @@
           <w:szCs w:val="28"/>
         </w:rPr>
       </w:pPr>
-      <w:proofErr w:type="gramStart"/>
-      <w:r>
-        <w:rPr>
-          <w:b/>
-          <w:bCs/>
-          <w:sz w:val="28"/>
-          <w:szCs w:val="28"/>
-        </w:rPr>
-        <w:t>Example :</w:t>
-      </w:r>
-      <w:proofErr w:type="gramEnd"/>
-      <w:r>
-        <w:rPr>
-          <w:b/>
-          <w:bCs/>
-          <w:sz w:val="28"/>
-          <w:szCs w:val="28"/>
-        </w:rPr>
-        <w:t xml:space="preserve"> </w:t>
+      <w:r>
+        <w:rPr>
+          <w:b/>
+          <w:bCs/>
+          <w:sz w:val="28"/>
+          <w:szCs w:val="28"/>
+        </w:rPr>
+        <w:t xml:space="preserve">Example: </w:t>
       </w:r>
       <w:r>
         <w:rPr>
@@ -1396,6 +1386,7 @@
         <w:rPr>
           <w:b/>
           <w:bCs/>
+          <w:noProof/>
           <w:sz w:val="28"/>
           <w:szCs w:val="28"/>
         </w:rPr>
@@ -1475,6 +1466,7 @@
         <w:rPr>
           <w:b/>
           <w:bCs/>
+          <w:noProof/>
           <w:sz w:val="28"/>
           <w:szCs w:val="28"/>
         </w:rPr>
@@ -1718,6 +1710,7 @@
         <w:rPr>
           <w:b/>
           <w:bCs/>
+          <w:noProof/>
           <w:sz w:val="28"/>
           <w:szCs w:val="28"/>
           <w:u w:val="single"/>
@@ -2376,6 +2369,7 @@
         <w:rPr>
           <w:b/>
           <w:bCs/>
+          <w:noProof/>
           <w:sz w:val="28"/>
           <w:szCs w:val="28"/>
         </w:rPr>
@@ -2510,6 +2504,7 @@
         <w:rPr>
           <w:b/>
           <w:bCs/>
+          <w:noProof/>
           <w:sz w:val="28"/>
           <w:szCs w:val="28"/>
         </w:rPr>
@@ -2802,21 +2797,7 @@
           <w:sz w:val="28"/>
           <w:szCs w:val="28"/>
         </w:rPr>
-        <w:t>“</w:t>
-      </w:r>
-      <w:r>
-        <w:rPr>
-          <w:sz w:val="28"/>
-          <w:szCs w:val="28"/>
-        </w:rPr>
-        <w:t>We</w:t>
-      </w:r>
-      <w:r>
-        <w:rPr>
-          <w:sz w:val="28"/>
-          <w:szCs w:val="28"/>
-        </w:rPr>
-        <w:t xml:space="preserve"> optimized S3 cost by moving rarely accessed data from S3 Standard to Glacier Deep Archive, which reduced storage cost.”</w:t>
+        <w:t>“We optimized S3 cost by moving rarely accessed data from S3 Standard to Glacier Deep Archive, which reduced storage cost.”</w:t>
       </w:r>
     </w:p>
     <w:p>
@@ -3249,6 +3230,7 @@
       </w:pPr>
       <w:r>
         <w:rPr>
+          <w:noProof/>
           <w:sz w:val="28"/>
           <w:szCs w:val="28"/>
         </w:rPr>
@@ -4826,6 +4808,7 @@
           <w:sz w:val="28"/>
           <w:szCs w:val="28"/>
         </w:rPr>
+        <w:lastRenderedPageBreak/>
         <w:t>30 days → IA</w:t>
       </w:r>
     </w:p>
@@ -4847,7 +4830,6 @@
           <w:sz w:val="28"/>
           <w:szCs w:val="28"/>
         </w:rPr>
-        <w:lastRenderedPageBreak/>
         <w:t>90 days → Glacier</w:t>
       </w:r>
     </w:p>
@@ -5453,6 +5435,7 @@
           <w:sz w:val="28"/>
           <w:szCs w:val="28"/>
         </w:rPr>
+        <w:lastRenderedPageBreak/>
         <w:t>Right-sizing</w:t>
       </w:r>
     </w:p>
@@ -5474,7 +5457,6 @@
           <w:sz w:val="28"/>
           <w:szCs w:val="28"/>
         </w:rPr>
-        <w:lastRenderedPageBreak/>
         <w:t>Spot</w:t>
       </w:r>
     </w:p>
@@ -8104,9 +8086,9 @@
       <w:lvlJc w:val="left"/>
       <w:pPr>
         <w:tabs>
-          <w:tab w:val="num" w:pos="720"/>
+          <w:tab w:val="num" w:pos="501"/>
         </w:tabs>
-        <w:ind w:left="720" w:hanging="360"/>
+        <w:ind w:left="501" w:hanging="360"/>
       </w:pPr>
       <w:rPr>
         <w:rFonts w:ascii="Symbol" w:hAnsi="Symbol" w:hint="default"/>
@@ -8120,9 +8102,9 @@
       <w:lvlJc w:val="left"/>
       <w:pPr>
         <w:tabs>
-          <w:tab w:val="num" w:pos="1440"/>
+          <w:tab w:val="num" w:pos="1221"/>
         </w:tabs>
-        <w:ind w:left="1440" w:hanging="360"/>
+        <w:ind w:left="1221" w:hanging="360"/>
       </w:pPr>
       <w:rPr>
         <w:rFonts w:ascii="Courier New" w:hAnsi="Courier New" w:hint="default"/>
@@ -8136,9 +8118,9 @@
       <w:lvlJc w:val="left"/>
       <w:pPr>
         <w:tabs>
-          <w:tab w:val="num" w:pos="2160"/>
+          <w:tab w:val="num" w:pos="1941"/>
         </w:tabs>
-        <w:ind w:left="2160" w:hanging="360"/>
+        <w:ind w:left="1941" w:hanging="360"/>
       </w:pPr>
       <w:rPr>
         <w:rFonts w:ascii="Wingdings" w:hAnsi="Wingdings" w:hint="default"/>
@@ -8152,9 +8134,9 @@
       <w:lvlJc w:val="left"/>
       <w:pPr>
         <w:tabs>
-          <w:tab w:val="num" w:pos="2880"/>
+          <w:tab w:val="num" w:pos="2661"/>
         </w:tabs>
-        <w:ind w:left="2880" w:hanging="360"/>
+        <w:ind w:left="2661" w:hanging="360"/>
       </w:pPr>
       <w:rPr>
         <w:rFonts w:ascii="Wingdings" w:hAnsi="Wingdings" w:hint="default"/>
@@ -8168,9 +8150,9 @@
       <w:lvlJc w:val="left"/>
       <w:pPr>
         <w:tabs>
-          <w:tab w:val="num" w:pos="3600"/>
+          <w:tab w:val="num" w:pos="3381"/>
         </w:tabs>
-        <w:ind w:left="3600" w:hanging="360"/>
+        <w:ind w:left="3381" w:hanging="360"/>
       </w:pPr>
       <w:rPr>
         <w:rFonts w:ascii="Wingdings" w:hAnsi="Wingdings" w:hint="default"/>
@@ -8184,9 +8166,9 @@
       <w:lvlJc w:val="left"/>
       <w:pPr>
         <w:tabs>
-          <w:tab w:val="num" w:pos="4320"/>
+          <w:tab w:val="num" w:pos="4101"/>
         </w:tabs>
-        <w:ind w:left="4320" w:hanging="360"/>
+        <w:ind w:left="4101" w:hanging="360"/>
       </w:pPr>
       <w:rPr>
         <w:rFonts w:ascii="Wingdings" w:hAnsi="Wingdings" w:hint="default"/>
@@ -8200,9 +8182,9 @@
       <w:lvlJc w:val="left"/>
       <w:pPr>
         <w:tabs>
-          <w:tab w:val="num" w:pos="5040"/>
+          <w:tab w:val="num" w:pos="4821"/>
         </w:tabs>
-        <w:ind w:left="5040" w:hanging="360"/>
+        <w:ind w:left="4821" w:hanging="360"/>
       </w:pPr>
       <w:rPr>
         <w:rFonts w:ascii="Wingdings" w:hAnsi="Wingdings" w:hint="default"/>
@@ -8216,9 +8198,9 @@
       <w:lvlJc w:val="left"/>
       <w:pPr>
         <w:tabs>
-          <w:tab w:val="num" w:pos="5760"/>
+          <w:tab w:val="num" w:pos="5541"/>
         </w:tabs>
-        <w:ind w:left="5760" w:hanging="360"/>
+        <w:ind w:left="5541" w:hanging="360"/>
       </w:pPr>
       <w:rPr>
         <w:rFonts w:ascii="Wingdings" w:hAnsi="Wingdings" w:hint="default"/>
@@ -8232,9 +8214,9 @@
       <w:lvlJc w:val="left"/>
       <w:pPr>
         <w:tabs>
-          <w:tab w:val="num" w:pos="6480"/>
+          <w:tab w:val="num" w:pos="6261"/>
         </w:tabs>
-        <w:ind w:left="6480" w:hanging="360"/>
+        <w:ind w:left="6261" w:hanging="360"/>
       </w:pPr>
       <w:rPr>
         <w:rFonts w:ascii="Wingdings" w:hAnsi="Wingdings" w:hint="default"/>
@@ -10324,6 +10306,7 @@
   <w:style w:type="character" w:default="1" w:styleId="DefaultParagraphFont">
     <w:name w:val="Default Paragraph Font"/>
     <w:uiPriority w:val="1"/>
+    <w:semiHidden/>
     <w:unhideWhenUsed/>
   </w:style>
   <w:style w:type="table" w:default="1" w:styleId="TableNormal">

</xml_diff>